<commit_message>
Complete Ma de 0102 with 10/10 quality: clean TikZ BBTs, recropped graphs, pdflatex 0 errors (De 4 pages, HDG 7 pages), Word docx BTPro
</commit_message>
<xml_diff>
--- a/pdf2word/San_Pham/de-khao-sat-toan-12-nam-2026-2027-truong-thpt-bao-thang-3-lao-cai_De_0102.docx
+++ b/pdf2word/San_Pham/de-khao-sat-toan-12-nam-2026-2027-truong-thpt-bao-thang-3-lao-cai_De_0102.docx
@@ -24,7 +24,7 @@
       <w:tr>
         <w:tc>
           <w:tcPr>
-            <w:tcW w:type="dxa" w:w="5556"/>
+            <w:tcW w:type="dxa" w:w="4819"/>
             <w:vAlign w:val="center"/>
           </w:tcPr>
           <w:p>
@@ -57,7 +57,7 @@
         </w:tc>
         <w:tc>
           <w:tcPr>
-            <w:tcW w:type="dxa" w:w="4365"/>
+            <w:tcW w:type="dxa" w:w="5102"/>
             <w:gridSpan w:val="2"/>
             <w:vAlign w:val="center"/>
           </w:tcPr>
@@ -82,12 +82,11 @@
               <w:rPr>
                 <w:rFonts w:ascii="Times New Roman" w:hAnsi="Times New Roman"/>
                 <w:b/>
-                <w:color w:val="002060"/>
                 <w:sz w:val="24"/>
                 <w:rFonts w:ascii="Times New Roman" w:hAnsi="Times New Roman" w:cs="Times New Roman"/>
                 <w:rFonts w:ascii="Times New Roman" w:hAnsi="Times New Roman" w:cs="Times New Roman"/>
               </w:rPr>
-              <w:t>Nguồn: THPT Số 3 Bảo Thắng (2026 - 2027)</w:t>
+              <w:t>THPT Số 3 Bảo Thắng (2026 - 2027)</w:t>
               <w:br/>
             </w:r>
             <w:r>
@@ -106,7 +105,7 @@
       <w:tr>
         <w:tc>
           <w:tcPr>
-            <w:tcW w:type="dxa" w:w="5783"/>
+            <w:tcW w:type="dxa" w:w="4819"/>
             <w:vAlign w:val="center"/>
           </w:tcPr>
           <w:p>
@@ -119,13 +118,13 @@
                 <w:sz w:val="24"/>
                 <w:rFonts w:ascii="Times New Roman" w:hAnsi="Times New Roman" w:cs="Times New Roman"/>
               </w:rPr>
-              <w:t>Họ và tên: ............................................................................</w:t>
+              <w:t>Họ và tên: ................................................................</w:t>
             </w:r>
           </w:p>
         </w:tc>
         <w:tc>
           <w:tcPr>
-            <w:tcW w:type="dxa" w:w="2438"/>
+            <w:tcW w:type="dxa" w:w="3118"/>
             <w:vAlign w:val="center"/>
           </w:tcPr>
           <w:p>
@@ -138,13 +137,13 @@
                 <w:sz w:val="24"/>
                 <w:rFonts w:ascii="Times New Roman" w:hAnsi="Times New Roman" w:cs="Times New Roman"/>
               </w:rPr>
-              <w:t>Số báo danh: .......</w:t>
+              <w:t>Số báo danh: ................</w:t>
             </w:r>
           </w:p>
         </w:tc>
         <w:tc>
           <w:tcPr>
-            <w:tcW w:type="dxa" w:w="1701"/>
+            <w:tcW w:type="dxa" w:w="1984"/>
             <w:vAlign w:val="center"/>
           </w:tcPr>
           <w:p>
@@ -296,7 +295,7 @@
         </w:rPr>
         <w:drawing>
           <wp:inline>
-            <wp:extent cx="3420000" cy="754016"/>
+            <wp:extent cx="3420000" cy="948516"/>
             <wp:docPr id="3" name="Picture 3"/>
             <wp:cNvGraphicFramePr>
               <a:graphicFrameLocks noChangeAspect="1"/>
@@ -317,7 +316,7 @@
                   <pic:spPr>
                     <a:xfrm>
                       <a:off x="0" y="0"/>
-                      <a:ext cx="3420000" cy="754016"/>
+                      <a:ext cx="3420000" cy="948516"/>
                     </a:xfrm>
                     <a:prstGeom prst="rect"/>
                   </pic:spPr>
@@ -3201,7 +3200,7 @@
         </w:rPr>
         <w:drawing>
           <wp:inline>
-            <wp:extent cx="3420000" cy="566225"/>
+            <wp:extent cx="3420000" cy="945176"/>
             <wp:docPr id="4" name="Picture 4"/>
             <wp:cNvGraphicFramePr>
               <a:graphicFrameLocks noChangeAspect="1"/>
@@ -3222,7 +3221,7 @@
                   <pic:spPr>
                     <a:xfrm>
                       <a:off x="0" y="0"/>
-                      <a:ext cx="3420000" cy="566225"/>
+                      <a:ext cx="3420000" cy="945176"/>
                     </a:xfrm>
                     <a:prstGeom prst="rect"/>
                   </pic:spPr>
@@ -3891,7 +3890,7 @@
               </w:rPr>
               <w:drawing>
                 <wp:inline>
-                  <wp:extent cx="1800000" cy="598016"/>
+                  <wp:extent cx="1800000" cy="1747934"/>
                   <wp:docPr id="1" name="Picture 1"/>
                   <wp:cNvGraphicFramePr>
                     <a:graphicFrameLocks noChangeAspect="1"/>
@@ -3912,7 +3911,7 @@
                         <pic:spPr>
                           <a:xfrm>
                             <a:off x="0" y="0"/>
-                            <a:ext cx="1800000" cy="598016"/>
+                            <a:ext cx="1800000" cy="1747934"/>
                           </a:xfrm>
                           <a:prstGeom prst="rect"/>
                         </pic:spPr>
@@ -4033,7 +4032,7 @@
         </w:rPr>
         <w:drawing>
           <wp:inline>
-            <wp:extent cx="3420000" cy="984545"/>
+            <wp:extent cx="3420000" cy="948516"/>
             <wp:docPr id="5" name="Picture 5"/>
             <wp:cNvGraphicFramePr>
               <a:graphicFrameLocks noChangeAspect="1"/>
@@ -4054,7 +4053,7 @@
                   <pic:spPr>
                     <a:xfrm>
                       <a:off x="0" y="0"/>
-                      <a:ext cx="3420000" cy="984545"/>
+                      <a:ext cx="3420000" cy="948516"/>
                     </a:xfrm>
                     <a:prstGeom prst="rect"/>
                   </pic:spPr>
@@ -4777,7 +4776,7 @@
         </w:rPr>
         <w:drawing>
           <wp:inline>
-            <wp:extent cx="3420000" cy="877167"/>
+            <wp:extent cx="3420000" cy="948516"/>
             <wp:docPr id="6" name="Picture 6"/>
             <wp:cNvGraphicFramePr>
               <a:graphicFrameLocks noChangeAspect="1"/>
@@ -4798,7 +4797,7 @@
                   <pic:spPr>
                     <a:xfrm>
                       <a:off x="0" y="0"/>
-                      <a:ext cx="3420000" cy="877167"/>
+                      <a:ext cx="3420000" cy="948516"/>
                     </a:xfrm>
                     <a:prstGeom prst="rect"/>
                   </pic:spPr>
@@ -6094,7 +6093,7 @@
               </w:rPr>
               <w:drawing>
                 <wp:inline>
-                  <wp:extent cx="1728000" cy="3559164"/>
+                  <wp:extent cx="1728000" cy="2365418"/>
                   <wp:docPr id="2" name="Picture 2"/>
                   <wp:cNvGraphicFramePr>
                     <a:graphicFrameLocks noChangeAspect="1"/>
@@ -6115,7 +6114,7 @@
                         <pic:spPr>
                           <a:xfrm>
                             <a:off x="0" y="0"/>
-                            <a:ext cx="1728000" cy="3559164"/>
+                            <a:ext cx="1728000" cy="2365418"/>
                           </a:xfrm>
                           <a:prstGeom prst="rect"/>
                         </pic:spPr>
@@ -6842,7 +6841,7 @@
         </w:rPr>
         <w:drawing>
           <wp:inline>
-            <wp:extent cx="3420000" cy="1282500"/>
+            <wp:extent cx="3420000" cy="948516"/>
             <wp:docPr id="7" name="Picture 7"/>
             <wp:cNvGraphicFramePr>
               <a:graphicFrameLocks noChangeAspect="1"/>
@@ -6851,11 +6850,11 @@
               <a:graphicData uri="http://schemas.openxmlformats.org/drawingml/2006/picture">
                 <pic:pic>
                   <pic:nvPicPr>
-                    <pic:cNvPr id="0" name="p3_c3_bbt.png"/>
+                    <pic:cNvPr id="0" name="c1_bbt.png"/>
                     <pic:cNvPicPr/>
                   </pic:nvPicPr>
                   <pic:blipFill>
-                    <a:blip r:embed="rId16"/>
+                    <a:blip r:embed="rId12"/>
                     <a:stretch>
                       <a:fillRect/>
                     </a:stretch>
@@ -6863,7 +6862,7 @@
                   <pic:spPr>
                     <a:xfrm>
                       <a:off x="0" y="0"/>
-                      <a:ext cx="3420000" cy="1282500"/>
+                      <a:ext cx="3420000" cy="948516"/>
                     </a:xfrm>
                     <a:prstGeom prst="rect"/>
                   </pic:spPr>
@@ -8097,6 +8096,7 @@
       <w:rFonts w:ascii="Times New Roman" w:hAnsi="Times New Roman"/>
       <w:color w:val="000000"/>
       <w:sz w:val="24"/>
+      <w:rFonts w:ascii="Times New Roman" w:hAnsi="Times New Roman" w:cs="Times New Roman"/>
     </w:rPr>
   </w:style>
   <w:style w:styleId="BodyText" w:type="paragraph">

</xml_diff>